<commit_message>
SEHHACA-217: interview: platform engineer
</commit_message>
<xml_diff>
--- a/assets/doc/interview/platform_engineer_technical_interview_prep.docx
+++ b/assets/doc/interview/platform_engineer_technical_interview_prep.docx
@@ -938,6 +938,48 @@
                 <w:sz w:val="16"/>
               </w:rPr>
               <w:t>Inventory -&gt; criticality -&gt; target model -&gt; POC -&gt; low-risk pilot -&gt; explicit schedule cutover -&gt; reconcile -&gt; soak -&gt; decommission -&gt; reverse-shadow handover.</w:t>
+            </w:r>
+          </w:p>
+        </w:tc>
+      </w:tr>
+      <w:tr>
+        <w:tc>
+          <w:tcPr>
+            <w:tcW w:type="dxa" w:w="5227"/>
+            <w:shd w:fill="E8EEF5"/>
+            <w:tcMar>
+              <w:top w:w="90" w:type="dxa"/>
+              <w:start w:w="100" w:type="dxa"/>
+              <w:bottom w:w="90" w:type="dxa"/>
+              <w:end w:w="100" w:type="dxa"/>
+            </w:tcMar>
+          </w:tcPr>
+          <w:p>
+            <w:r>
+              <w:rPr>
+                <w:b/>
+                <w:sz w:val="16"/>
+              </w:rPr>
+              <w:t>Cloud vs OSS</w:t>
+            </w:r>
+          </w:p>
+        </w:tc>
+        <w:tc>
+          <w:tcPr>
+            <w:tcW w:type="dxa" w:w="5227"/>
+            <w:tcMar>
+              <w:top w:w="90" w:type="dxa"/>
+              <w:start w:w="100" w:type="dxa"/>
+              <w:bottom w:w="90" w:type="dxa"/>
+              <w:end w:w="100" w:type="dxa"/>
+            </w:tcMar>
+          </w:tcPr>
+          <w:p>
+            <w:r>
+              <w:rPr>
+                <w:sz w:val="16"/>
+              </w:rPr>
+              <w:t>Self-hosted = Vitol runs Prefect control plane. Cloud = Prefect runs control plane; ECS workers/flows can remain in Vitol AWS.</w:t>
             </w:r>
           </w:p>
         </w:tc>
@@ -4078,6 +4120,2323 @@
     </w:p>
     <w:p>
       <w:pPr>
+        <w:keepNext/>
+        <w:pageBreakBefore/>
+        <w:spacing w:after="80"/>
+      </w:pPr>
+      <w:r>
+        <w:rPr>
+          <w:b/>
+          <w:color w:val="F28C28"/>
+          <w:sz w:val="16"/>
+        </w:rPr>
+        <w:t>5A | PREFECT CLOUD VS SELF-HOSTED</w:t>
+      </w:r>
+    </w:p>
+    <w:p>
+      <w:pPr>
+        <w:pStyle w:val="Heading1"/>
+      </w:pPr>
+      <w:r>
+        <w:t>Prefect Cloud vs on-prem / self-hosted Prefect OSS</w:t>
+      </w:r>
+    </w:p>
+    <w:p>
+      <w:pPr>
+        <w:pStyle w:val="Small"/>
+      </w:pPr>
+      <w:r>
+        <w:t>This is one of the central architecture decisions in the Vitol engagement. Know the difference at both a simple and platform-engineering level.</w:t>
+      </w:r>
+    </w:p>
+    <w:tbl>
+      <w:tblPr>
+        <w:tblW w:type="auto" w:w="0"/>
+        <w:jc w:val="center"/>
+        <w:tblLook w:firstColumn="1" w:firstRow="1" w:lastColumn="0" w:lastRow="0" w:noHBand="0" w:noVBand="1" w:val="04A0"/>
+      </w:tblPr>
+      <w:tblGrid>
+        <w:gridCol w:w="10454"/>
+      </w:tblGrid>
+      <w:tr>
+        <w:trPr>
+          <w:cantSplit/>
+        </w:trPr>
+        <w:tc>
+          <w:tcPr>
+            <w:tcW w:type="dxa" w:w="10454"/>
+            <w:shd w:fill="EAF4EA"/>
+            <w:tcMar>
+              <w:top w:w="120" w:type="dxa"/>
+              <w:start w:w="150" w:type="dxa"/>
+              <w:bottom w:w="120" w:type="dxa"/>
+              <w:end w:w="150" w:type="dxa"/>
+            </w:tcMar>
+          </w:tcPr>
+          <w:p>
+            <w:pPr/>
+            <w:r>
+              <w:rPr>
+                <w:b/>
+                <w:color w:val="123B63"/>
+              </w:rPr>
+              <w:t xml:space="preserve">MEMORISE  </w:t>
+            </w:r>
+            <w:r>
+              <w:t>Prefect Open Source/self-hosted means Vitol operates the Prefect orchestration control plane. Prefect Cloud means Prefect operates that control plane as a managed service. The workflow execution can still remain inside Vitol AWS.</w:t>
+            </w:r>
+          </w:p>
+        </w:tc>
+      </w:tr>
+    </w:tbl>
+    <w:p>
+      <w:pPr>
+        <w:pStyle w:val="Heading2"/>
+      </w:pPr>
+      <w:r>
+        <w:t>Side-by-side comparison</w:t>
+      </w:r>
+    </w:p>
+    <w:tbl>
+      <w:tblPr>
+        <w:tblStyle w:val="TableGrid"/>
+        <w:tblW w:type="auto" w:w="0"/>
+        <w:jc w:val="center"/>
+        <w:tblLayout w:type="fixed"/>
+        <w:tblLook w:firstColumn="1" w:firstRow="1" w:lastColumn="0" w:lastRow="0" w:noHBand="0" w:noVBand="1" w:val="04A0"/>
+      </w:tblPr>
+      <w:tblGrid>
+        <w:gridCol w:w="3485"/>
+        <w:gridCol w:w="3485"/>
+        <w:gridCol w:w="3485"/>
+      </w:tblGrid>
+      <w:tr>
+        <w:trPr>
+          <w:tblHeader w:val="true"/>
+          <w:cantSplit/>
+        </w:trPr>
+        <w:tc>
+          <w:tcPr>
+            <w:tcW w:type="dxa" w:w="2088"/>
+            <w:shd w:fill="123B63"/>
+            <w:tcMar>
+              <w:top w:w="90" w:type="dxa"/>
+              <w:start w:w="100" w:type="dxa"/>
+              <w:bottom w:w="90" w:type="dxa"/>
+              <w:end w:w="100" w:type="dxa"/>
+            </w:tcMar>
+            <w:vAlign w:val="center"/>
+          </w:tcPr>
+          <w:p>
+            <w:r>
+              <w:rPr>
+                <w:b/>
+                <w:color w:val="FFFFFF"/>
+                <w:sz w:val="16"/>
+              </w:rPr>
+              <w:t>Area</w:t>
+            </w:r>
+          </w:p>
+        </w:tc>
+        <w:tc>
+          <w:tcPr>
+            <w:tcW w:type="dxa" w:w="3384"/>
+            <w:shd w:fill="123B63"/>
+            <w:tcMar>
+              <w:top w:w="90" w:type="dxa"/>
+              <w:start w:w="100" w:type="dxa"/>
+              <w:bottom w:w="90" w:type="dxa"/>
+              <w:end w:w="100" w:type="dxa"/>
+            </w:tcMar>
+            <w:vAlign w:val="center"/>
+          </w:tcPr>
+          <w:p>
+            <w:r>
+              <w:rPr>
+                <w:b/>
+                <w:color w:val="FFFFFF"/>
+                <w:sz w:val="16"/>
+              </w:rPr>
+              <w:t>Self-hosted Prefect OSS</w:t>
+            </w:r>
+          </w:p>
+        </w:tc>
+        <w:tc>
+          <w:tcPr>
+            <w:tcW w:type="dxa" w:w="3384"/>
+            <w:shd w:fill="123B63"/>
+            <w:tcMar>
+              <w:top w:w="90" w:type="dxa"/>
+              <w:start w:w="100" w:type="dxa"/>
+              <w:bottom w:w="90" w:type="dxa"/>
+              <w:end w:w="100" w:type="dxa"/>
+            </w:tcMar>
+            <w:vAlign w:val="center"/>
+          </w:tcPr>
+          <w:p>
+            <w:r>
+              <w:rPr>
+                <w:b/>
+                <w:color w:val="FFFFFF"/>
+                <w:sz w:val="16"/>
+              </w:rPr>
+              <w:t>Prefect Cloud</w:t>
+            </w:r>
+          </w:p>
+        </w:tc>
+      </w:tr>
+      <w:tr>
+        <w:trPr>
+          <w:cantSplit/>
+        </w:trPr>
+        <w:tc>
+          <w:tcPr>
+            <w:tcW w:type="dxa" w:w="2088"/>
+            <w:tcMar>
+              <w:top w:w="90" w:type="dxa"/>
+              <w:start w:w="100" w:type="dxa"/>
+              <w:bottom w:w="90" w:type="dxa"/>
+              <w:end w:w="100" w:type="dxa"/>
+            </w:tcMar>
+            <w:vAlign w:val="top"/>
+            <w:shd w:fill="E8EEF5"/>
+          </w:tcPr>
+          <w:p>
+            <w:r>
+              <w:rPr>
+                <w:b/>
+                <w:sz w:val="16"/>
+              </w:rPr>
+              <w:t>Prefect API / server</w:t>
+            </w:r>
+          </w:p>
+        </w:tc>
+        <w:tc>
+          <w:tcPr>
+            <w:tcW w:type="dxa" w:w="3384"/>
+            <w:tcMar>
+              <w:top w:w="90" w:type="dxa"/>
+              <w:start w:w="100" w:type="dxa"/>
+              <w:bottom w:w="90" w:type="dxa"/>
+              <w:end w:w="100" w:type="dxa"/>
+            </w:tcMar>
+            <w:vAlign w:val="top"/>
+          </w:tcPr>
+          <w:p>
+            <w:r>
+              <w:rPr>
+                <w:sz w:val="16"/>
+              </w:rPr>
+              <w:t>Vitol operates and monitors it.</w:t>
+            </w:r>
+          </w:p>
+        </w:tc>
+        <w:tc>
+          <w:tcPr>
+            <w:tcW w:type="dxa" w:w="3384"/>
+            <w:tcMar>
+              <w:top w:w="90" w:type="dxa"/>
+              <w:start w:w="100" w:type="dxa"/>
+              <w:bottom w:w="90" w:type="dxa"/>
+              <w:end w:w="100" w:type="dxa"/>
+            </w:tcMar>
+            <w:vAlign w:val="top"/>
+          </w:tcPr>
+          <w:p>
+            <w:r>
+              <w:rPr>
+                <w:sz w:val="16"/>
+              </w:rPr>
+              <w:t>Prefect operates the managed control plane.</w:t>
+            </w:r>
+          </w:p>
+        </w:tc>
+      </w:tr>
+      <w:tr>
+        <w:trPr>
+          <w:cantSplit/>
+        </w:trPr>
+        <w:tc>
+          <w:tcPr>
+            <w:tcW w:type="dxa" w:w="2088"/>
+            <w:tcMar>
+              <w:top w:w="90" w:type="dxa"/>
+              <w:start w:w="100" w:type="dxa"/>
+              <w:bottom w:w="90" w:type="dxa"/>
+              <w:end w:w="100" w:type="dxa"/>
+            </w:tcMar>
+            <w:vAlign w:val="top"/>
+            <w:shd w:fill="E8EEF5"/>
+          </w:tcPr>
+          <w:p>
+            <w:r>
+              <w:rPr>
+                <w:b/>
+                <w:sz w:val="16"/>
+              </w:rPr>
+              <w:t>Orchestration database</w:t>
+            </w:r>
+          </w:p>
+        </w:tc>
+        <w:tc>
+          <w:tcPr>
+            <w:tcW w:type="dxa" w:w="3384"/>
+            <w:tcMar>
+              <w:top w:w="90" w:type="dxa"/>
+              <w:start w:w="100" w:type="dxa"/>
+              <w:bottom w:w="90" w:type="dxa"/>
+              <w:end w:w="100" w:type="dxa"/>
+            </w:tcMar>
+            <w:vAlign w:val="top"/>
+          </w:tcPr>
+          <w:p>
+            <w:r>
+              <w:rPr>
+                <w:sz w:val="16"/>
+              </w:rPr>
+              <w:t>Vitol operates PostgreSQL/RDS, backups and recovery.</w:t>
+            </w:r>
+          </w:p>
+        </w:tc>
+        <w:tc>
+          <w:tcPr>
+            <w:tcW w:type="dxa" w:w="3384"/>
+            <w:tcMar>
+              <w:top w:w="90" w:type="dxa"/>
+              <w:start w:w="100" w:type="dxa"/>
+              <w:bottom w:w="90" w:type="dxa"/>
+              <w:end w:w="100" w:type="dxa"/>
+            </w:tcMar>
+            <w:vAlign w:val="top"/>
+          </w:tcPr>
+          <w:p>
+            <w:r>
+              <w:rPr>
+                <w:sz w:val="16"/>
+              </w:rPr>
+              <w:t>Managed as part of the Prefect Cloud service.</w:t>
+            </w:r>
+          </w:p>
+        </w:tc>
+      </w:tr>
+      <w:tr>
+        <w:trPr>
+          <w:cantSplit/>
+        </w:trPr>
+        <w:tc>
+          <w:tcPr>
+            <w:tcW w:type="dxa" w:w="2088"/>
+            <w:tcMar>
+              <w:top w:w="90" w:type="dxa"/>
+              <w:start w:w="100" w:type="dxa"/>
+              <w:bottom w:w="90" w:type="dxa"/>
+              <w:end w:w="100" w:type="dxa"/>
+            </w:tcMar>
+            <w:vAlign w:val="top"/>
+            <w:shd w:fill="E8EEF5"/>
+          </w:tcPr>
+          <w:p>
+            <w:r>
+              <w:rPr>
+                <w:b/>
+                <w:sz w:val="16"/>
+              </w:rPr>
+              <w:t>Upgrades</w:t>
+            </w:r>
+          </w:p>
+        </w:tc>
+        <w:tc>
+          <w:tcPr>
+            <w:tcW w:type="dxa" w:w="3384"/>
+            <w:tcMar>
+              <w:top w:w="90" w:type="dxa"/>
+              <w:start w:w="100" w:type="dxa"/>
+              <w:bottom w:w="90" w:type="dxa"/>
+              <w:end w:w="100" w:type="dxa"/>
+            </w:tcMar>
+            <w:vAlign w:val="top"/>
+          </w:tcPr>
+          <w:p>
+            <w:r>
+              <w:rPr>
+                <w:sz w:val="16"/>
+              </w:rPr>
+              <w:t>Vitol plans, tests and executes server/database upgrades.</w:t>
+            </w:r>
+          </w:p>
+        </w:tc>
+        <w:tc>
+          <w:tcPr>
+            <w:tcW w:type="dxa" w:w="3384"/>
+            <w:tcMar>
+              <w:top w:w="90" w:type="dxa"/>
+              <w:start w:w="100" w:type="dxa"/>
+              <w:bottom w:w="90" w:type="dxa"/>
+              <w:end w:w="100" w:type="dxa"/>
+            </w:tcMar>
+            <w:vAlign w:val="top"/>
+          </w:tcPr>
+          <w:p>
+            <w:r>
+              <w:rPr>
+                <w:sz w:val="16"/>
+              </w:rPr>
+              <w:t>Prefect manages Cloud service upgrades; Vitol still manages worker/runtime compatibility.</w:t>
+            </w:r>
+          </w:p>
+        </w:tc>
+      </w:tr>
+      <w:tr>
+        <w:trPr>
+          <w:cantSplit/>
+        </w:trPr>
+        <w:tc>
+          <w:tcPr>
+            <w:tcW w:type="dxa" w:w="2088"/>
+            <w:tcMar>
+              <w:top w:w="90" w:type="dxa"/>
+              <w:start w:w="100" w:type="dxa"/>
+              <w:bottom w:w="90" w:type="dxa"/>
+              <w:end w:w="100" w:type="dxa"/>
+            </w:tcMar>
+            <w:vAlign w:val="top"/>
+            <w:shd w:fill="E8EEF5"/>
+          </w:tcPr>
+          <w:p>
+            <w:r>
+              <w:rPr>
+                <w:b/>
+                <w:sz w:val="16"/>
+              </w:rPr>
+              <w:t>HA / scaling</w:t>
+            </w:r>
+          </w:p>
+        </w:tc>
+        <w:tc>
+          <w:tcPr>
+            <w:tcW w:type="dxa" w:w="3384"/>
+            <w:tcMar>
+              <w:top w:w="90" w:type="dxa"/>
+              <w:start w:w="100" w:type="dxa"/>
+              <w:bottom w:w="90" w:type="dxa"/>
+              <w:end w:w="100" w:type="dxa"/>
+            </w:tcMar>
+            <w:vAlign w:val="top"/>
+          </w:tcPr>
+          <w:p>
+            <w:r>
+              <w:rPr>
+                <w:sz w:val="16"/>
+              </w:rPr>
+              <w:t>Designed and operated by Vitol.</w:t>
+            </w:r>
+          </w:p>
+        </w:tc>
+        <w:tc>
+          <w:tcPr>
+            <w:tcW w:type="dxa" w:w="3384"/>
+            <w:tcMar>
+              <w:top w:w="90" w:type="dxa"/>
+              <w:start w:w="100" w:type="dxa"/>
+              <w:bottom w:w="90" w:type="dxa"/>
+              <w:end w:w="100" w:type="dxa"/>
+            </w:tcMar>
+            <w:vAlign w:val="top"/>
+          </w:tcPr>
+          <w:p>
+            <w:r>
+              <w:rPr>
+                <w:sz w:val="16"/>
+              </w:rPr>
+              <w:t>Control-plane availability is a managed-service responsibility.</w:t>
+            </w:r>
+          </w:p>
+        </w:tc>
+      </w:tr>
+      <w:tr>
+        <w:trPr>
+          <w:cantSplit/>
+        </w:trPr>
+        <w:tc>
+          <w:tcPr>
+            <w:tcW w:type="dxa" w:w="2088"/>
+            <w:tcMar>
+              <w:top w:w="90" w:type="dxa"/>
+              <w:start w:w="100" w:type="dxa"/>
+              <w:bottom w:w="90" w:type="dxa"/>
+              <w:end w:w="100" w:type="dxa"/>
+            </w:tcMar>
+            <w:vAlign w:val="top"/>
+            <w:shd w:fill="E8EEF5"/>
+          </w:tcPr>
+          <w:p>
+            <w:r>
+              <w:rPr>
+                <w:b/>
+                <w:sz w:val="16"/>
+              </w:rPr>
+              <w:t>Backups / recovery</w:t>
+            </w:r>
+          </w:p>
+        </w:tc>
+        <w:tc>
+          <w:tcPr>
+            <w:tcW w:type="dxa" w:w="3384"/>
+            <w:tcMar>
+              <w:top w:w="90" w:type="dxa"/>
+              <w:start w:w="100" w:type="dxa"/>
+              <w:bottom w:w="90" w:type="dxa"/>
+              <w:end w:w="100" w:type="dxa"/>
+            </w:tcMar>
+            <w:vAlign w:val="top"/>
+          </w:tcPr>
+          <w:p>
+            <w:r>
+              <w:rPr>
+                <w:sz w:val="16"/>
+              </w:rPr>
+              <w:t>Vitol owns backup, restore and RTO/RPO procedures.</w:t>
+            </w:r>
+          </w:p>
+        </w:tc>
+        <w:tc>
+          <w:tcPr>
+            <w:tcW w:type="dxa" w:w="3384"/>
+            <w:tcMar>
+              <w:top w:w="90" w:type="dxa"/>
+              <w:start w:w="100" w:type="dxa"/>
+              <w:bottom w:w="90" w:type="dxa"/>
+              <w:end w:w="100" w:type="dxa"/>
+            </w:tcMar>
+            <w:vAlign w:val="top"/>
+          </w:tcPr>
+          <w:p>
+            <w:r>
+              <w:rPr>
+                <w:sz w:val="16"/>
+              </w:rPr>
+              <w:t>Control-plane recovery is part of the managed-service model; Vitol still needs business recovery/replay procedures.</w:t>
+            </w:r>
+          </w:p>
+        </w:tc>
+      </w:tr>
+      <w:tr>
+        <w:trPr>
+          <w:cantSplit/>
+        </w:trPr>
+        <w:tc>
+          <w:tcPr>
+            <w:tcW w:type="dxa" w:w="2088"/>
+            <w:tcMar>
+              <w:top w:w="90" w:type="dxa"/>
+              <w:start w:w="100" w:type="dxa"/>
+              <w:bottom w:w="90" w:type="dxa"/>
+              <w:end w:w="100" w:type="dxa"/>
+            </w:tcMar>
+            <w:vAlign w:val="top"/>
+            <w:shd w:fill="E8EEF5"/>
+          </w:tcPr>
+          <w:p>
+            <w:r>
+              <w:rPr>
+                <w:b/>
+                <w:sz w:val="16"/>
+              </w:rPr>
+              <w:t>Authentication / identity</w:t>
+            </w:r>
+          </w:p>
+        </w:tc>
+        <w:tc>
+          <w:tcPr>
+            <w:tcW w:type="dxa" w:w="3384"/>
+            <w:tcMar>
+              <w:top w:w="90" w:type="dxa"/>
+              <w:start w:w="100" w:type="dxa"/>
+              <w:bottom w:w="90" w:type="dxa"/>
+              <w:end w:w="100" w:type="dxa"/>
+            </w:tcMar>
+            <w:vAlign w:val="top"/>
+          </w:tcPr>
+          <w:p>
+            <w:r>
+              <w:rPr>
+                <w:sz w:val="16"/>
+              </w:rPr>
+              <w:t>Self-managed/internal integration.</w:t>
+            </w:r>
+          </w:p>
+        </w:tc>
+        <w:tc>
+          <w:tcPr>
+            <w:tcW w:type="dxa" w:w="3384"/>
+            <w:tcMar>
+              <w:top w:w="90" w:type="dxa"/>
+              <w:start w:w="100" w:type="dxa"/>
+              <w:bottom w:w="90" w:type="dxa"/>
+              <w:end w:w="100" w:type="dxa"/>
+            </w:tcMar>
+            <w:vAlign w:val="top"/>
+          </w:tcPr>
+          <w:p>
+            <w:r>
+              <w:rPr>
+                <w:sz w:val="16"/>
+              </w:rPr>
+              <w:t>Enterprise identity options such as SSO, RBAC and service accounts depending on plan.</w:t>
+            </w:r>
+          </w:p>
+        </w:tc>
+      </w:tr>
+      <w:tr>
+        <w:trPr>
+          <w:cantSplit/>
+        </w:trPr>
+        <w:tc>
+          <w:tcPr>
+            <w:tcW w:type="dxa" w:w="2088"/>
+            <w:tcMar>
+              <w:top w:w="90" w:type="dxa"/>
+              <w:start w:w="100" w:type="dxa"/>
+              <w:bottom w:w="90" w:type="dxa"/>
+              <w:end w:w="100" w:type="dxa"/>
+            </w:tcMar>
+            <w:vAlign w:val="top"/>
+            <w:shd w:fill="E8EEF5"/>
+          </w:tcPr>
+          <w:p>
+            <w:r>
+              <w:rPr>
+                <w:b/>
+                <w:sz w:val="16"/>
+              </w:rPr>
+              <w:t>Audit / governance</w:t>
+            </w:r>
+          </w:p>
+        </w:tc>
+        <w:tc>
+          <w:tcPr>
+            <w:tcW w:type="dxa" w:w="3384"/>
+            <w:tcMar>
+              <w:top w:w="90" w:type="dxa"/>
+              <w:start w:w="100" w:type="dxa"/>
+              <w:bottom w:w="90" w:type="dxa"/>
+              <w:end w:w="100" w:type="dxa"/>
+            </w:tcMar>
+            <w:vAlign w:val="top"/>
+          </w:tcPr>
+          <w:p>
+            <w:r>
+              <w:rPr>
+                <w:sz w:val="16"/>
+              </w:rPr>
+              <w:t>Must be built/operated around the self-hosted platform.</w:t>
+            </w:r>
+          </w:p>
+        </w:tc>
+        <w:tc>
+          <w:tcPr>
+            <w:tcW w:type="dxa" w:w="3384"/>
+            <w:tcMar>
+              <w:top w:w="90" w:type="dxa"/>
+              <w:start w:w="100" w:type="dxa"/>
+              <w:bottom w:w="90" w:type="dxa"/>
+              <w:end w:w="100" w:type="dxa"/>
+            </w:tcMar>
+            <w:vAlign w:val="top"/>
+          </w:tcPr>
+          <w:p>
+            <w:r>
+              <w:rPr>
+                <w:sz w:val="16"/>
+              </w:rPr>
+              <w:t>Cloud provides enterprise governance/audit capabilities depending on subscription.</w:t>
+            </w:r>
+          </w:p>
+        </w:tc>
+      </w:tr>
+      <w:tr>
+        <w:trPr>
+          <w:cantSplit/>
+        </w:trPr>
+        <w:tc>
+          <w:tcPr>
+            <w:tcW w:type="dxa" w:w="2088"/>
+            <w:tcMar>
+              <w:top w:w="90" w:type="dxa"/>
+              <w:start w:w="100" w:type="dxa"/>
+              <w:bottom w:w="90" w:type="dxa"/>
+              <w:end w:w="100" w:type="dxa"/>
+            </w:tcMar>
+            <w:vAlign w:val="top"/>
+            <w:shd w:fill="E8EEF5"/>
+          </w:tcPr>
+          <w:p>
+            <w:r>
+              <w:rPr>
+                <w:b/>
+                <w:sz w:val="16"/>
+              </w:rPr>
+              <w:t>Workers</w:t>
+            </w:r>
+          </w:p>
+        </w:tc>
+        <w:tc>
+          <w:tcPr>
+            <w:tcW w:type="dxa" w:w="3384"/>
+            <w:tcMar>
+              <w:top w:w="90" w:type="dxa"/>
+              <w:start w:w="100" w:type="dxa"/>
+              <w:bottom w:w="90" w:type="dxa"/>
+              <w:end w:w="100" w:type="dxa"/>
+            </w:tcMar>
+            <w:vAlign w:val="top"/>
+          </w:tcPr>
+          <w:p>
+            <w:r>
+              <w:rPr>
+                <w:sz w:val="16"/>
+              </w:rPr>
+              <w:t>Vitol runs workers.</w:t>
+            </w:r>
+          </w:p>
+        </w:tc>
+        <w:tc>
+          <w:tcPr>
+            <w:tcW w:type="dxa" w:w="3384"/>
+            <w:tcMar>
+              <w:top w:w="90" w:type="dxa"/>
+              <w:start w:w="100" w:type="dxa"/>
+              <w:bottom w:w="90" w:type="dxa"/>
+              <w:end w:w="100" w:type="dxa"/>
+            </w:tcMar>
+            <w:vAlign w:val="top"/>
+          </w:tcPr>
+          <w:p>
+            <w:r>
+              <w:rPr>
+                <w:sz w:val="16"/>
+              </w:rPr>
+              <w:t>Vitol can still run workers in a hybrid model.</w:t>
+            </w:r>
+          </w:p>
+        </w:tc>
+      </w:tr>
+      <w:tr>
+        <w:trPr>
+          <w:cantSplit/>
+        </w:trPr>
+        <w:tc>
+          <w:tcPr>
+            <w:tcW w:type="dxa" w:w="2088"/>
+            <w:tcMar>
+              <w:top w:w="90" w:type="dxa"/>
+              <w:start w:w="100" w:type="dxa"/>
+              <w:bottom w:w="90" w:type="dxa"/>
+              <w:end w:w="100" w:type="dxa"/>
+            </w:tcMar>
+            <w:vAlign w:val="top"/>
+            <w:shd w:fill="E8EEF5"/>
+          </w:tcPr>
+          <w:p>
+            <w:r>
+              <w:rPr>
+                <w:b/>
+                <w:sz w:val="16"/>
+              </w:rPr>
+              <w:t>ECS execution</w:t>
+            </w:r>
+          </w:p>
+        </w:tc>
+        <w:tc>
+          <w:tcPr>
+            <w:tcW w:type="dxa" w:w="3384"/>
+            <w:tcMar>
+              <w:top w:w="90" w:type="dxa"/>
+              <w:start w:w="100" w:type="dxa"/>
+              <w:bottom w:w="90" w:type="dxa"/>
+              <w:end w:w="100" w:type="dxa"/>
+            </w:tcMar>
+            <w:vAlign w:val="top"/>
+          </w:tcPr>
+          <w:p>
+            <w:r>
+              <w:rPr>
+                <w:sz w:val="16"/>
+              </w:rPr>
+              <w:t>Runs inside Vitol AWS.</w:t>
+            </w:r>
+          </w:p>
+        </w:tc>
+        <w:tc>
+          <w:tcPr>
+            <w:tcW w:type="dxa" w:w="3384"/>
+            <w:tcMar>
+              <w:top w:w="90" w:type="dxa"/>
+              <w:start w:w="100" w:type="dxa"/>
+              <w:bottom w:w="90" w:type="dxa"/>
+              <w:end w:w="100" w:type="dxa"/>
+            </w:tcMar>
+            <w:vAlign w:val="top"/>
+          </w:tcPr>
+          <w:p>
+            <w:r>
+              <w:rPr>
+                <w:sz w:val="16"/>
+              </w:rPr>
+              <w:t>Can remain inside Vitol AWS.</w:t>
+            </w:r>
+          </w:p>
+        </w:tc>
+      </w:tr>
+      <w:tr>
+        <w:trPr>
+          <w:cantSplit/>
+        </w:trPr>
+        <w:tc>
+          <w:tcPr>
+            <w:tcW w:type="dxa" w:w="2088"/>
+            <w:tcMar>
+              <w:top w:w="90" w:type="dxa"/>
+              <w:start w:w="100" w:type="dxa"/>
+              <w:bottom w:w="90" w:type="dxa"/>
+              <w:end w:w="100" w:type="dxa"/>
+            </w:tcMar>
+            <w:vAlign w:val="top"/>
+            <w:shd w:fill="E8EEF5"/>
+          </w:tcPr>
+          <w:p>
+            <w:r>
+              <w:rPr>
+                <w:b/>
+                <w:sz w:val="16"/>
+              </w:rPr>
+              <w:t>Infrastructure operations</w:t>
+            </w:r>
+          </w:p>
+        </w:tc>
+        <w:tc>
+          <w:tcPr>
+            <w:tcW w:type="dxa" w:w="3384"/>
+            <w:tcMar>
+              <w:top w:w="90" w:type="dxa"/>
+              <w:start w:w="100" w:type="dxa"/>
+              <w:bottom w:w="90" w:type="dxa"/>
+              <w:end w:w="100" w:type="dxa"/>
+            </w:tcMar>
+            <w:vAlign w:val="top"/>
+          </w:tcPr>
+          <w:p>
+            <w:r>
+              <w:rPr>
+                <w:sz w:val="16"/>
+              </w:rPr>
+              <w:t>Higher: server, DB, LB, patching, upgrades plus workers.</w:t>
+            </w:r>
+          </w:p>
+        </w:tc>
+        <w:tc>
+          <w:tcPr>
+            <w:tcW w:type="dxa" w:w="3384"/>
+            <w:tcMar>
+              <w:top w:w="90" w:type="dxa"/>
+              <w:start w:w="100" w:type="dxa"/>
+              <w:bottom w:w="90" w:type="dxa"/>
+              <w:end w:w="100" w:type="dxa"/>
+            </w:tcMar>
+            <w:vAlign w:val="top"/>
+          </w:tcPr>
+          <w:p>
+            <w:r>
+              <w:rPr>
+                <w:sz w:val="16"/>
+              </w:rPr>
+              <w:t>Lower control-plane burden; Vitol still owns execution, IAM, networking, images and application reliability.</w:t>
+            </w:r>
+          </w:p>
+        </w:tc>
+      </w:tr>
+      <w:tr>
+        <w:trPr>
+          <w:cantSplit/>
+        </w:trPr>
+        <w:tc>
+          <w:tcPr>
+            <w:tcW w:type="dxa" w:w="2088"/>
+            <w:tcMar>
+              <w:top w:w="90" w:type="dxa"/>
+              <w:start w:w="100" w:type="dxa"/>
+              <w:bottom w:w="90" w:type="dxa"/>
+              <w:end w:w="100" w:type="dxa"/>
+            </w:tcMar>
+            <w:vAlign w:val="top"/>
+            <w:shd w:fill="E8EEF5"/>
+          </w:tcPr>
+          <w:p>
+            <w:r>
+              <w:rPr>
+                <w:b/>
+                <w:sz w:val="16"/>
+              </w:rPr>
+              <w:t>Cost model</w:t>
+            </w:r>
+          </w:p>
+        </w:tc>
+        <w:tc>
+          <w:tcPr>
+            <w:tcW w:type="dxa" w:w="3384"/>
+            <w:tcMar>
+              <w:top w:w="90" w:type="dxa"/>
+              <w:start w:w="100" w:type="dxa"/>
+              <w:bottom w:w="90" w:type="dxa"/>
+              <w:end w:w="100" w:type="dxa"/>
+            </w:tcMar>
+            <w:vAlign w:val="top"/>
+          </w:tcPr>
+          <w:p>
+            <w:r>
+              <w:rPr>
+                <w:sz w:val="16"/>
+              </w:rPr>
+              <w:t>AWS infrastructure + engineering/operational time.</w:t>
+            </w:r>
+          </w:p>
+        </w:tc>
+        <w:tc>
+          <w:tcPr>
+            <w:tcW w:type="dxa" w:w="3384"/>
+            <w:tcMar>
+              <w:top w:w="90" w:type="dxa"/>
+              <w:start w:w="100" w:type="dxa"/>
+              <w:bottom w:w="90" w:type="dxa"/>
+              <w:end w:w="100" w:type="dxa"/>
+            </w:tcMar>
+            <w:vAlign w:val="top"/>
+          </w:tcPr>
+          <w:p>
+            <w:r>
+              <w:rPr>
+                <w:sz w:val="16"/>
+              </w:rPr>
+              <w:t>SaaS licence + remaining AWS execution + reduced control-plane operations.</w:t>
+            </w:r>
+          </w:p>
+        </w:tc>
+      </w:tr>
+      <w:tr>
+        <w:trPr>
+          <w:cantSplit/>
+        </w:trPr>
+        <w:tc>
+          <w:tcPr>
+            <w:tcW w:type="dxa" w:w="2088"/>
+            <w:tcMar>
+              <w:top w:w="90" w:type="dxa"/>
+              <w:start w:w="100" w:type="dxa"/>
+              <w:bottom w:w="90" w:type="dxa"/>
+              <w:end w:w="100" w:type="dxa"/>
+            </w:tcMar>
+            <w:vAlign w:val="top"/>
+            <w:shd w:fill="E8EEF5"/>
+          </w:tcPr>
+          <w:p>
+            <w:r>
+              <w:rPr>
+                <w:b/>
+                <w:sz w:val="16"/>
+              </w:rPr>
+              <w:t>Control</w:t>
+            </w:r>
+          </w:p>
+        </w:tc>
+        <w:tc>
+          <w:tcPr>
+            <w:tcW w:type="dxa" w:w="3384"/>
+            <w:tcMar>
+              <w:top w:w="90" w:type="dxa"/>
+              <w:start w:w="100" w:type="dxa"/>
+              <w:bottom w:w="90" w:type="dxa"/>
+              <w:end w:w="100" w:type="dxa"/>
+            </w:tcMar>
+            <w:vAlign w:val="top"/>
+          </w:tcPr>
+          <w:p>
+            <w:r>
+              <w:rPr>
+                <w:sz w:val="16"/>
+              </w:rPr>
+              <w:t>Maximum infrastructure/control-plane control.</w:t>
+            </w:r>
+          </w:p>
+        </w:tc>
+        <w:tc>
+          <w:tcPr>
+            <w:tcW w:type="dxa" w:w="3384"/>
+            <w:tcMar>
+              <w:top w:w="90" w:type="dxa"/>
+              <w:start w:w="100" w:type="dxa"/>
+              <w:bottom w:w="90" w:type="dxa"/>
+              <w:end w:w="100" w:type="dxa"/>
+            </w:tcMar>
+            <w:vAlign w:val="top"/>
+          </w:tcPr>
+          <w:p>
+            <w:r>
+              <w:rPr>
+                <w:sz w:val="16"/>
+              </w:rPr>
+              <w:t>Some control-plane responsibility is delegated to Prefect.</w:t>
+            </w:r>
+          </w:p>
+        </w:tc>
+      </w:tr>
+    </w:tbl>
+    <w:p>
+      <w:pPr>
+        <w:pStyle w:val="Heading2"/>
+      </w:pPr>
+      <w:r>
+        <w:t>What the “control plane” means</w:t>
+      </w:r>
+    </w:p>
+    <w:p>
+      <w:pPr/>
+      <w:r>
+        <w:t>The control plane is the orchestration layer that knows about schedules, deployments, run states, work pools/queues, automations, API/UI and orchestration metadata. It decides what should run and tracks orchestration state; it does not have to be where the business workload itself executes.</w:t>
+      </w:r>
+    </w:p>
+    <w:tbl>
+      <w:tblPr>
+        <w:tblW w:type="auto" w:w="0"/>
+        <w:jc w:val="center"/>
+        <w:tblLook w:firstColumn="1" w:firstRow="1" w:lastColumn="0" w:lastRow="0" w:noHBand="0" w:noVBand="1" w:val="04A0"/>
+      </w:tblPr>
+      <w:tblGrid>
+        <w:gridCol w:w="10454"/>
+      </w:tblGrid>
+      <w:tr>
+        <w:trPr>
+          <w:cantSplit/>
+        </w:trPr>
+        <w:tc>
+          <w:tcPr>
+            <w:tcW w:type="dxa" w:w="10454"/>
+            <w:shd w:fill="F3F5F7"/>
+            <w:tcMar>
+              <w:top w:w="100" w:type="dxa"/>
+              <w:start w:w="140" w:type="dxa"/>
+              <w:bottom w:w="100" w:type="dxa"/>
+              <w:end w:w="140" w:type="dxa"/>
+            </w:tcMar>
+          </w:tcPr>
+          <w:p>
+            <w:pPr>
+              <w:pStyle w:val="Code"/>
+              <w:spacing w:after="0"/>
+            </w:pPr>
+            <w:r>
+              <w:t>CONTROL PLANE</w:t>
+            </w:r>
+            <w:r>
+              <w:br/>
+            </w:r>
+            <w:r>
+              <w:t>Schedules -&gt; Deployments -&gt; Flow-run state -&gt; Work pools / queues</w:t>
+            </w:r>
+            <w:r>
+              <w:br/>
+            </w:r>
+            <w:r>
+              <w:t xml:space="preserve">                         -&gt; Automations -&gt; API / UI -&gt; Metadata</w:t>
+            </w:r>
+          </w:p>
+        </w:tc>
+      </w:tr>
+    </w:tbl>
+    <w:p>
+      <w:pPr>
+        <w:pStyle w:val="Heading2"/>
+      </w:pPr>
+      <w:r>
+        <w:t>Self-hosted model</w:t>
+      </w:r>
+    </w:p>
+    <w:p>
+      <w:pPr/>
+      <w:r>
+        <w:t>In a self-hosted design, Vitol is responsible for the Prefect service and its operational dependencies as well as the execution layer.</w:t>
+      </w:r>
+    </w:p>
+    <w:tbl>
+      <w:tblPr>
+        <w:tblW w:type="auto" w:w="0"/>
+        <w:jc w:val="center"/>
+        <w:tblLook w:firstColumn="1" w:firstRow="1" w:lastColumn="0" w:lastRow="0" w:noHBand="0" w:noVBand="1" w:val="04A0"/>
+      </w:tblPr>
+      <w:tblGrid>
+        <w:gridCol w:w="10454"/>
+      </w:tblGrid>
+      <w:tr>
+        <w:trPr>
+          <w:cantSplit/>
+        </w:trPr>
+        <w:tc>
+          <w:tcPr>
+            <w:tcW w:type="dxa" w:w="10454"/>
+            <w:shd w:fill="F3F5F7"/>
+            <w:tcMar>
+              <w:top w:w="100" w:type="dxa"/>
+              <w:start w:w="140" w:type="dxa"/>
+              <w:bottom w:w="100" w:type="dxa"/>
+              <w:end w:w="140" w:type="dxa"/>
+            </w:tcMar>
+          </w:tcPr>
+          <w:p>
+            <w:pPr>
+              <w:pStyle w:val="Code"/>
+              <w:spacing w:after="0"/>
+            </w:pPr>
+            <w:r>
+              <w:t>VITOL AWS</w:t>
+            </w:r>
+            <w:r>
+              <w:br/>
+            </w:r>
+            <w:r/>
+            <w:r>
+              <w:br/>
+            </w:r>
+            <w:r>
+              <w:t>Prefect Server / API</w:t>
+            </w:r>
+            <w:r>
+              <w:br/>
+            </w:r>
+            <w:r>
+              <w:t xml:space="preserve">        |</w:t>
+            </w:r>
+            <w:r>
+              <w:br/>
+            </w:r>
+            <w:r>
+              <w:t xml:space="preserve">        v</w:t>
+            </w:r>
+            <w:r>
+              <w:br/>
+            </w:r>
+            <w:r>
+              <w:t>PostgreSQL / RDS</w:t>
+            </w:r>
+            <w:r>
+              <w:br/>
+            </w:r>
+            <w:r>
+              <w:t xml:space="preserve">        |</w:t>
+            </w:r>
+            <w:r>
+              <w:br/>
+            </w:r>
+            <w:r>
+              <w:t xml:space="preserve">        v</w:t>
+            </w:r>
+            <w:r>
+              <w:br/>
+            </w:r>
+            <w:r>
+              <w:t>Work Pools / Queues</w:t>
+            </w:r>
+            <w:r>
+              <w:br/>
+            </w:r>
+            <w:r>
+              <w:t xml:space="preserve">        ^</w:t>
+            </w:r>
+            <w:r>
+              <w:br/>
+            </w:r>
+            <w:r>
+              <w:t xml:space="preserve">        | polls</w:t>
+            </w:r>
+            <w:r>
+              <w:br/>
+            </w:r>
+            <w:r>
+              <w:t>Prefect Workers</w:t>
+            </w:r>
+            <w:r>
+              <w:br/>
+            </w:r>
+            <w:r>
+              <w:t xml:space="preserve">        |</w:t>
+            </w:r>
+            <w:r>
+              <w:br/>
+            </w:r>
+            <w:r>
+              <w:t xml:space="preserve">        v</w:t>
+            </w:r>
+            <w:r>
+              <w:br/>
+            </w:r>
+            <w:r>
+              <w:t>ECS / EC2 execution</w:t>
+            </w:r>
+            <w:r>
+              <w:br/>
+            </w:r>
+            <w:r>
+              <w:t xml:space="preserve">        |</w:t>
+            </w:r>
+            <w:r>
+              <w:br/>
+            </w:r>
+            <w:r>
+              <w:t xml:space="preserve">        v</w:t>
+            </w:r>
+            <w:r>
+              <w:br/>
+            </w:r>
+            <w:r>
+              <w:t>Python flows</w:t>
+            </w:r>
+            <w:r>
+              <w:br/>
+            </w:r>
+            <w:r/>
+            <w:r>
+              <w:br/>
+            </w:r>
+            <w:r>
+              <w:t>Vitol operates the control plane AND the execution layer</w:t>
+            </w:r>
+          </w:p>
+        </w:tc>
+      </w:tr>
+    </w:tbl>
+    <w:p>
+      <w:pPr>
+        <w:pStyle w:val="Heading2"/>
+      </w:pPr>
+      <w:r>
+        <w:t>Prefect Cloud with execution retained in Vitol AWS</w:t>
+      </w:r>
+    </w:p>
+    <w:p>
+      <w:pPr/>
+      <w:r>
+        <w:t>A Cloud migration does not automatically mean the trading workflows or their data run inside Prefect-managed compute. With a hybrid work-pool model, Prefect Cloud can provide orchestration while the workers and flow containers remain in Vitol-owned AWS infrastructure.</w:t>
+      </w:r>
+    </w:p>
+    <w:tbl>
+      <w:tblPr>
+        <w:tblW w:type="auto" w:w="0"/>
+        <w:jc w:val="center"/>
+        <w:tblLook w:firstColumn="1" w:firstRow="1" w:lastColumn="0" w:lastRow="0" w:noHBand="0" w:noVBand="1" w:val="04A0"/>
+      </w:tblPr>
+      <w:tblGrid>
+        <w:gridCol w:w="10454"/>
+      </w:tblGrid>
+      <w:tr>
+        <w:trPr>
+          <w:cantSplit/>
+        </w:trPr>
+        <w:tc>
+          <w:tcPr>
+            <w:tcW w:type="dxa" w:w="10454"/>
+            <w:shd w:fill="F3F5F7"/>
+            <w:tcMar>
+              <w:top w:w="100" w:type="dxa"/>
+              <w:start w:w="140" w:type="dxa"/>
+              <w:bottom w:w="100" w:type="dxa"/>
+              <w:end w:w="140" w:type="dxa"/>
+            </w:tcMar>
+          </w:tcPr>
+          <w:p>
+            <w:pPr>
+              <w:pStyle w:val="Code"/>
+              <w:spacing w:after="0"/>
+            </w:pPr>
+            <w:r>
+              <w:t>PREFECT CLOUD</w:t>
+            </w:r>
+            <w:r>
+              <w:br/>
+            </w:r>
+            <w:r>
+              <w:t>API / UI / Scheduling / Run metadata / Work pools / Identity</w:t>
+            </w:r>
+            <w:r>
+              <w:br/>
+            </w:r>
+            <w:r>
+              <w:t xml:space="preserve">                         |</w:t>
+            </w:r>
+            <w:r>
+              <w:br/>
+            </w:r>
+            <w:r>
+              <w:t xml:space="preserve">                         | HTTPS</w:t>
+            </w:r>
+            <w:r>
+              <w:br/>
+            </w:r>
+            <w:r>
+              <w:t xml:space="preserve">                         v</w:t>
+            </w:r>
+            <w:r>
+              <w:br/>
+            </w:r>
+            <w:r>
+              <w:t>VITOL AWS</w:t>
+            </w:r>
+            <w:r>
+              <w:br/>
+            </w:r>
+            <w:r>
+              <w:t>Prefect ECS Worker -&gt; ECS Task -&gt; Python Flow -&gt; S3 / RDS / APIs / Snowflake</w:t>
+            </w:r>
+          </w:p>
+        </w:tc>
+      </w:tr>
+    </w:tbl>
+    <w:tbl>
+      <w:tblPr>
+        <w:tblW w:type="auto" w:w="0"/>
+        <w:jc w:val="center"/>
+        <w:tblLook w:firstColumn="1" w:firstRow="1" w:lastColumn="0" w:lastRow="0" w:noHBand="0" w:noVBand="1" w:val="04A0"/>
+      </w:tblPr>
+      <w:tblGrid>
+        <w:gridCol w:w="10454"/>
+      </w:tblGrid>
+      <w:tr>
+        <w:trPr>
+          <w:cantSplit/>
+        </w:trPr>
+        <w:tc>
+          <w:tcPr>
+            <w:tcW w:type="dxa" w:w="10454"/>
+            <w:shd w:fill="EAF2F8"/>
+            <w:tcMar>
+              <w:top w:w="120" w:type="dxa"/>
+              <w:start w:w="150" w:type="dxa"/>
+              <w:bottom w:w="120" w:type="dxa"/>
+              <w:end w:w="150" w:type="dxa"/>
+            </w:tcMar>
+          </w:tcPr>
+          <w:p>
+            <w:pPr/>
+            <w:r>
+              <w:rPr>
+                <w:b/>
+                <w:color w:val="123B63"/>
+              </w:rPr>
+              <w:t xml:space="preserve">INTERVIEW POINT  </w:t>
+            </w:r>
+            <w:r>
+              <w:t>Moving to Prefect Cloud can outsource the orchestration control plane while preserving the AWS execution/security boundary for the actual workloads.</w:t>
+            </w:r>
+          </w:p>
+        </w:tc>
+      </w:tr>
+    </w:tbl>
+    <w:p>
+      <w:pPr>
+        <w:pStyle w:val="Heading2"/>
+      </w:pPr>
+      <w:r>
+        <w:t>Workers and execution models</w:t>
+      </w:r>
+    </w:p>
+    <w:p>
+      <w:pPr/>
+      <w:r>
+        <w:t>For a traditional hybrid work pool, the worker belongs to Vitol. It polls Prefect Cloud for work, then submits the flow run to Vitol infrastructure such as ECS. The Python flow does not need to execute inside the worker process.</w:t>
+      </w:r>
+    </w:p>
+    <w:tbl>
+      <w:tblPr>
+        <w:tblW w:type="auto" w:w="0"/>
+        <w:jc w:val="center"/>
+        <w:tblLook w:firstColumn="1" w:firstRow="1" w:lastColumn="0" w:lastRow="0" w:noHBand="0" w:noVBand="1" w:val="04A0"/>
+      </w:tblPr>
+      <w:tblGrid>
+        <w:gridCol w:w="10454"/>
+      </w:tblGrid>
+      <w:tr>
+        <w:trPr>
+          <w:cantSplit/>
+        </w:trPr>
+        <w:tc>
+          <w:tcPr>
+            <w:tcW w:type="dxa" w:w="10454"/>
+            <w:shd w:fill="F3F5F7"/>
+            <w:tcMar>
+              <w:top w:w="100" w:type="dxa"/>
+              <w:start w:w="140" w:type="dxa"/>
+              <w:bottom w:w="100" w:type="dxa"/>
+              <w:end w:w="140" w:type="dxa"/>
+            </w:tcMar>
+          </w:tcPr>
+          <w:p>
+            <w:pPr>
+              <w:pStyle w:val="Code"/>
+              <w:spacing w:after="0"/>
+            </w:pPr>
+            <w:r>
+              <w:t>Prefect Cloud</w:t>
+            </w:r>
+            <w:r>
+              <w:br/>
+            </w:r>
+            <w:r>
+              <w:t xml:space="preserve">      ^</w:t>
+            </w:r>
+            <w:r>
+              <w:br/>
+            </w:r>
+            <w:r>
+              <w:t xml:space="preserve">      | worker polls</w:t>
+            </w:r>
+            <w:r>
+              <w:br/>
+            </w:r>
+            <w:r>
+              <w:t xml:space="preserve">      |</w:t>
+            </w:r>
+            <w:r>
+              <w:br/>
+            </w:r>
+            <w:r>
+              <w:t>Vitol ECS Worker</w:t>
+            </w:r>
+            <w:r>
+              <w:br/>
+            </w:r>
+            <w:r>
+              <w:t xml:space="preserve">      | RunTask</w:t>
+            </w:r>
+            <w:r>
+              <w:br/>
+            </w:r>
+            <w:r>
+              <w:t xml:space="preserve">      v</w:t>
+            </w:r>
+            <w:r>
+              <w:br/>
+            </w:r>
+            <w:r>
+              <w:t>Vitol ECS Task</w:t>
+            </w:r>
+            <w:r>
+              <w:br/>
+            </w:r>
+            <w:r>
+              <w:t xml:space="preserve">      |</w:t>
+            </w:r>
+            <w:r>
+              <w:br/>
+            </w:r>
+            <w:r>
+              <w:t xml:space="preserve">      v</w:t>
+            </w:r>
+            <w:r>
+              <w:br/>
+            </w:r>
+            <w:r>
+              <w:t>Python Flow</w:t>
+            </w:r>
+          </w:p>
+        </w:tc>
+      </w:tr>
+    </w:tbl>
+    <w:p>
+      <w:pPr/>
+      <w:r>
+        <w:t>Prefect Cloud also supports push and managed execution models. A technical evaluation should compare them, but for desk-critical/internal workloads do not assume managed compute is the target. Validate security, networking, data access and operational requirements first.</w:t>
+      </w:r>
+    </w:p>
+    <w:p>
+      <w:pPr>
+        <w:pStyle w:val="Heading2"/>
+      </w:pPr>
+      <w:r>
+        <w:t>Security and identity separation</w:t>
+      </w:r>
+    </w:p>
+    <w:p>
+      <w:pPr/>
+      <w:r>
+        <w:t>A clean Cloud design separates Prefect identity from AWS workload identity:</w:t>
+      </w:r>
+    </w:p>
+    <w:tbl>
+      <w:tblPr>
+        <w:tblW w:type="auto" w:w="0"/>
+        <w:jc w:val="center"/>
+        <w:tblLook w:firstColumn="1" w:firstRow="1" w:lastColumn="0" w:lastRow="0" w:noHBand="0" w:noVBand="1" w:val="04A0"/>
+      </w:tblPr>
+      <w:tblGrid>
+        <w:gridCol w:w="10454"/>
+      </w:tblGrid>
+      <w:tr>
+        <w:trPr>
+          <w:cantSplit/>
+        </w:trPr>
+        <w:tc>
+          <w:tcPr>
+            <w:tcW w:type="dxa" w:w="10454"/>
+            <w:shd w:fill="F3F5F7"/>
+            <w:tcMar>
+              <w:top w:w="100" w:type="dxa"/>
+              <w:start w:w="140" w:type="dxa"/>
+              <w:bottom w:w="100" w:type="dxa"/>
+              <w:end w:w="140" w:type="dxa"/>
+            </w:tcMar>
+          </w:tcPr>
+          <w:p>
+            <w:pPr>
+              <w:pStyle w:val="Code"/>
+              <w:spacing w:after="0"/>
+            </w:pPr>
+            <w:r>
+              <w:t>HUMAN IDENTITY</w:t>
+            </w:r>
+            <w:r>
+              <w:br/>
+            </w:r>
+            <w:r>
+              <w:t>Employee -&gt; Microsoft Entra ID -&gt; SSO/OIDC/SAML -&gt; Prefect Cloud -&gt; RBAC</w:t>
+            </w:r>
+            <w:r>
+              <w:br/>
+            </w:r>
+            <w:r/>
+            <w:r>
+              <w:br/>
+            </w:r>
+            <w:r>
+              <w:t>MACHINE / PREFECT IDENTITY</w:t>
+            </w:r>
+            <w:r>
+              <w:br/>
+            </w:r>
+            <w:r>
+              <w:t>ECS Worker -&gt; Prefect service account/API credential -&gt; Prefect Cloud API</w:t>
+            </w:r>
+            <w:r>
+              <w:br/>
+            </w:r>
+            <w:r/>
+            <w:r>
+              <w:br/>
+            </w:r>
+            <w:r>
+              <w:t>AWS WORKLOAD IDENTITY</w:t>
+            </w:r>
+            <w:r>
+              <w:br/>
+            </w:r>
+            <w:r>
+              <w:t>ECS Task -&gt; IAM Task Role -&gt; S3 / RDS / Secrets Manager / internal AWS services</w:t>
+            </w:r>
+          </w:p>
+        </w:tc>
+      </w:tr>
+    </w:tbl>
+    <w:tbl>
+      <w:tblPr>
+        <w:tblW w:type="auto" w:w="0"/>
+        <w:jc w:val="center"/>
+        <w:tblLook w:firstColumn="1" w:firstRow="1" w:lastColumn="0" w:lastRow="0" w:noHBand="0" w:noVBand="1" w:val="04A0"/>
+      </w:tblPr>
+      <w:tblGrid>
+        <w:gridCol w:w="10454"/>
+      </w:tblGrid>
+      <w:tr>
+        <w:trPr>
+          <w:cantSplit/>
+        </w:trPr>
+        <w:tc>
+          <w:tcPr>
+            <w:tcW w:type="dxa" w:w="10454"/>
+            <w:shd w:fill="EAF4EA"/>
+            <w:tcMar>
+              <w:top w:w="120" w:type="dxa"/>
+              <w:start w:w="150" w:type="dxa"/>
+              <w:bottom w:w="120" w:type="dxa"/>
+              <w:end w:w="150" w:type="dxa"/>
+            </w:tcMar>
+          </w:tcPr>
+          <w:p>
+            <w:pPr/>
+            <w:r>
+              <w:rPr>
+                <w:b/>
+                <w:color w:val="123B63"/>
+              </w:rPr>
+              <w:t xml:space="preserve">GOOD LINE  </w:t>
+            </w:r>
+            <w:r>
+              <w:t>Human identity should come from enterprise SSO; machine access should use dedicated service identities; AWS access should stay least-privilege through task roles.</w:t>
+            </w:r>
+          </w:p>
+        </w:tc>
+      </w:tr>
+    </w:tbl>
+    <w:p>
+      <w:pPr>
+        <w:pStyle w:val="Heading2"/>
+      </w:pPr>
+      <w:r>
+        <w:t>Why Vitol might move to Prefect Cloud</w:t>
+      </w:r>
+    </w:p>
+    <w:p>
+      <w:pPr/>
+      <w:r>
+        <w:t>The attraction is not simply “Cloud is easier”. It is the possibility of removing significant control-plane operational toil while improving standard enterprise controls.</w:t>
+      </w:r>
+    </w:p>
+    <w:p>
+      <w:pPr>
+        <w:pStyle w:val="ListBullet"/>
+      </w:pPr>
+      <w:r>
+        <w:t>Reduce Prefect server and orchestration-database operational burden.</w:t>
+      </w:r>
+    </w:p>
+    <w:p>
+      <w:pPr>
+        <w:pStyle w:val="ListBullet"/>
+      </w:pPr>
+      <w:r>
+        <w:t>Reduce manual control-plane upgrade and patching work.</w:t>
+      </w:r>
+    </w:p>
+    <w:p>
+      <w:pPr>
+        <w:pStyle w:val="ListBullet"/>
+      </w:pPr>
+      <w:r>
+        <w:t>Use enterprise SSO/RBAC/service-account and audit capabilities where licensed.</w:t>
+      </w:r>
+    </w:p>
+    <w:p>
+      <w:pPr>
+        <w:pStyle w:val="ListBullet"/>
+      </w:pPr>
+      <w:r>
+        <w:t>Standardise onboarding and operational ownership across many teams.</w:t>
+      </w:r>
+    </w:p>
+    <w:p>
+      <w:pPr>
+        <w:pStyle w:val="ListBullet"/>
+      </w:pPr>
+      <w:r>
+        <w:t>Shift some availability/support responsibility to the SaaS provider.</w:t>
+      </w:r>
+    </w:p>
+    <w:p>
+      <w:pPr>
+        <w:pStyle w:val="ListBullet"/>
+      </w:pPr>
+      <w:r>
+        <w:t>Let Vitol focus engineering effort on ECS execution, workflow reliability and business outcomes.</w:t>
+      </w:r>
+    </w:p>
+    <w:p>
+      <w:pPr>
+        <w:pStyle w:val="Heading2"/>
+      </w:pPr>
+      <w:r>
+        <w:t>Why Vitol should NOT automatically move everything</w:t>
+      </w:r>
+    </w:p>
+    <w:p>
+      <w:pPr/>
+      <w:r>
+        <w:t>The correct recommendation should be evidence-based. Prefect Cloud introduces a commercial SaaS dependency and changes the security/networking/control-plane operating model.</w:t>
+      </w:r>
+    </w:p>
+    <w:p>
+      <w:pPr>
+        <w:pStyle w:val="ListBullet"/>
+      </w:pPr>
+      <w:r>
+        <w:t>What orchestration metadata, logs and identifiers leave Vitol?</w:t>
+      </w:r>
+    </w:p>
+    <w:p>
+      <w:pPr>
+        <w:pStyle w:val="ListBullet"/>
+      </w:pPr>
+      <w:r>
+        <w:t>What outbound network connectivity is required from workers?</w:t>
+      </w:r>
+    </w:p>
+    <w:p>
+      <w:pPr>
+        <w:pStyle w:val="ListBullet"/>
+      </w:pPr>
+      <w:r>
+        <w:t>Does the identity/RBAC model meet Entra, InfoSec and audit requirements?</w:t>
+      </w:r>
+    </w:p>
+    <w:p>
+      <w:pPr>
+        <w:pStyle w:val="ListBullet"/>
+      </w:pPr>
+      <w:r>
+        <w:t>What is the vendor SLA/support/escalation model?</w:t>
+      </w:r>
+    </w:p>
+    <w:p>
+      <w:pPr>
+        <w:pStyle w:val="ListBullet"/>
+      </w:pPr>
+      <w:r>
+        <w:t>What happens operationally if Cloud or the network path is unavailable?</w:t>
+      </w:r>
+    </w:p>
+    <w:p>
+      <w:pPr>
+        <w:pStyle w:val="ListBullet"/>
+      </w:pPr>
+      <w:r>
+        <w:t>What is the licence cost versus current AWS plus engineering operational cost?</w:t>
+      </w:r>
+    </w:p>
+    <w:p>
+      <w:pPr>
+        <w:pStyle w:val="ListBullet"/>
+      </w:pPr>
+      <w:r>
+        <w:t>What is the migration effort, historical-data impact and rollback path?</w:t>
+      </w:r>
+    </w:p>
+    <w:p>
+      <w:pPr>
+        <w:pStyle w:val="ListBullet"/>
+      </w:pPr>
+      <w:r>
+        <w:t>How reversible is the decision if Vitol later wants to return to self-hosting?</w:t>
+      </w:r>
+    </w:p>
+    <w:p>
+      <w:pPr>
+        <w:pStyle w:val="Heading2"/>
+      </w:pPr>
+      <w:r>
+        <w:t>What can disappear after a successful Cloud migration?</w:t>
+      </w:r>
+    </w:p>
+    <w:p>
+      <w:pPr/>
+      <w:r>
+        <w:t>Depending on the final design, much of the self-hosted control-plane stack can potentially be retired. Execution infrastructure does not necessarily disappear.</w:t>
+      </w:r>
+    </w:p>
+    <w:tbl>
+      <w:tblPr>
+        <w:tblW w:type="auto" w:w="0"/>
+        <w:jc w:val="center"/>
+        <w:tblLook w:firstColumn="1" w:firstRow="1" w:lastColumn="0" w:lastRow="0" w:noHBand="0" w:noVBand="1" w:val="04A0"/>
+      </w:tblPr>
+      <w:tblGrid>
+        <w:gridCol w:w="10454"/>
+      </w:tblGrid>
+      <w:tr>
+        <w:trPr>
+          <w:cantSplit/>
+        </w:trPr>
+        <w:tc>
+          <w:tcPr>
+            <w:tcW w:type="dxa" w:w="10454"/>
+            <w:shd w:fill="F3F5F7"/>
+            <w:tcMar>
+              <w:top w:w="100" w:type="dxa"/>
+              <w:start w:w="140" w:type="dxa"/>
+              <w:bottom w:w="100" w:type="dxa"/>
+              <w:end w:w="140" w:type="dxa"/>
+            </w:tcMar>
+          </w:tcPr>
+          <w:p>
+            <w:pPr>
+              <w:pStyle w:val="Code"/>
+              <w:spacing w:after="0"/>
+            </w:pPr>
+            <w:r>
+              <w:t>POTENTIALLY RETIRED</w:t>
+            </w:r>
+            <w:r>
+              <w:br/>
+            </w:r>
+            <w:r>
+              <w:t>Prefect server/API hosts</w:t>
+            </w:r>
+            <w:r>
+              <w:br/>
+            </w:r>
+            <w:r>
+              <w:t>EC2/Ansible used only for the Prefect control plane</w:t>
+            </w:r>
+            <w:r>
+              <w:br/>
+            </w:r>
+            <w:r>
+              <w:t>Prefect orchestration RDS</w:t>
+            </w:r>
+            <w:r>
+              <w:br/>
+            </w:r>
+            <w:r>
+              <w:t>Control-plane load balancer</w:t>
+            </w:r>
+            <w:r>
+              <w:br/>
+            </w:r>
+            <w:r>
+              <w:t>Control-plane patching / DB upgrades / backup operations</w:t>
+            </w:r>
+            <w:r>
+              <w:br/>
+            </w:r>
+            <w:r/>
+            <w:r>
+              <w:br/>
+            </w:r>
+            <w:r>
+              <w:t>LIKELY REMAINS IN VITOL AWS</w:t>
+            </w:r>
+            <w:r>
+              <w:br/>
+            </w:r>
+            <w:r>
+              <w:t>ECS workers/tasks or other workload runtime</w:t>
+            </w:r>
+            <w:r>
+              <w:br/>
+            </w:r>
+            <w:r>
+              <w:t>ECR images</w:t>
+            </w:r>
+            <w:r>
+              <w:br/>
+            </w:r>
+            <w:r>
+              <w:t>IAM roles</w:t>
+            </w:r>
+            <w:r>
+              <w:br/>
+            </w:r>
+            <w:r>
+              <w:t>Secrets Manager</w:t>
+            </w:r>
+            <w:r>
+              <w:br/>
+            </w:r>
+            <w:r>
+              <w:t>VPC/networking</w:t>
+            </w:r>
+            <w:r>
+              <w:br/>
+            </w:r>
+            <w:r>
+              <w:t>Application/workflow code</w:t>
+            </w:r>
+            <w:r>
+              <w:br/>
+            </w:r>
+            <w:r>
+              <w:t>Data-quality and business monitoring</w:t>
+            </w:r>
+          </w:p>
+        </w:tc>
+      </w:tr>
+    </w:tbl>
+    <w:p>
+      <w:pPr>
+        <w:pStyle w:val="Heading2"/>
+      </w:pPr>
+      <w:r>
+        <w:t>What actually makes OSS -&gt; Cloud migration difficult?</w:t>
+      </w:r>
+    </w:p>
+    <w:p>
+      <w:pPr/>
+      <w:r>
+        <w:t>The Python business logic is often not the hardest part. The risky work is moving the surrounding operational model safely.</w:t>
+      </w:r>
+    </w:p>
+    <w:p>
+      <w:pPr>
+        <w:pStyle w:val="ListBullet"/>
+      </w:pPr>
+      <w:r>
+        <w:t>Deployments and schedules.</w:t>
+      </w:r>
+    </w:p>
+    <w:p>
+      <w:pPr>
+        <w:pStyle w:val="ListBullet"/>
+      </w:pPr>
+      <w:r>
+        <w:t>Work pools and work queues.</w:t>
+      </w:r>
+    </w:p>
+    <w:p>
+      <w:pPr>
+        <w:pStyle w:val="ListBullet"/>
+      </w:pPr>
+      <w:r>
+        <w:t>Variables, blocks and concurrency settings.</w:t>
+      </w:r>
+    </w:p>
+    <w:p>
+      <w:pPr>
+        <w:pStyle w:val="ListBullet"/>
+      </w:pPr>
+      <w:r>
+        <w:t>Secrets and machine identities.</w:t>
+      </w:r>
+    </w:p>
+    <w:p>
+      <w:pPr>
+        <w:pStyle w:val="ListBullet"/>
+      </w:pPr>
+      <w:r>
+        <w:t>Worker/runtime infrastructure and networking.</w:t>
+      </w:r>
+    </w:p>
+    <w:p>
+      <w:pPr>
+        <w:pStyle w:val="ListBullet"/>
+      </w:pPr>
+      <w:r>
+        <w:t>Historical observability expectations.</w:t>
+      </w:r>
+    </w:p>
+    <w:p>
+      <w:pPr>
+        <w:pStyle w:val="ListBullet"/>
+      </w:pPr>
+      <w:r>
+        <w:t>RBAC and team/workspace structure.</w:t>
+      </w:r>
+    </w:p>
+    <w:p>
+      <w:pPr>
+        <w:pStyle w:val="ListBullet"/>
+      </w:pPr>
+      <w:r>
+        <w:t>Explicit schedule cutover so old and new control planes do not both execute the same business process.</w:t>
+      </w:r>
+    </w:p>
+    <w:p>
+      <w:pPr>
+        <w:pStyle w:val="ListBullet"/>
+      </w:pPr>
+      <w:r>
+        <w:t>Idempotent replay, reconciliation and rollback for desk-critical workloads.</w:t>
+      </w:r>
+    </w:p>
+    <w:p>
+      <w:pPr>
+        <w:pStyle w:val="Heading2"/>
+      </w:pPr>
+      <w:r>
+        <w:t>Likely technical-round questions</w:t>
+      </w:r>
+    </w:p>
+    <w:tbl>
+      <w:tblPr>
+        <w:tblStyle w:val="TableGrid"/>
+        <w:tblW w:type="auto" w:w="0"/>
+        <w:jc w:val="center"/>
+        <w:tblLayout w:type="fixed"/>
+        <w:tblLook w:firstColumn="1" w:firstRow="1" w:lastColumn="0" w:lastRow="0" w:noHBand="0" w:noVBand="1" w:val="04A0"/>
+      </w:tblPr>
+      <w:tblGrid>
+        <w:gridCol w:w="5227"/>
+        <w:gridCol w:w="5227"/>
+      </w:tblGrid>
+      <w:tr>
+        <w:trPr>
+          <w:tblHeader w:val="true"/>
+          <w:cantSplit/>
+        </w:trPr>
+        <w:tc>
+          <w:tcPr>
+            <w:tcW w:type="dxa" w:w="3384"/>
+            <w:shd w:fill="123B63"/>
+            <w:tcMar>
+              <w:top w:w="90" w:type="dxa"/>
+              <w:start w:w="100" w:type="dxa"/>
+              <w:bottom w:w="90" w:type="dxa"/>
+              <w:end w:w="100" w:type="dxa"/>
+            </w:tcMar>
+          </w:tcPr>
+          <w:p>
+            <w:r>
+              <w:rPr>
+                <w:b/>
+                <w:color w:val="FFFFFF"/>
+                <w:sz w:val="16"/>
+              </w:rPr>
+              <w:t>Question</w:t>
+            </w:r>
+          </w:p>
+        </w:tc>
+        <w:tc>
+          <w:tcPr>
+            <w:tcW w:type="dxa" w:w="5472"/>
+            <w:shd w:fill="123B63"/>
+            <w:tcMar>
+              <w:top w:w="90" w:type="dxa"/>
+              <w:start w:w="100" w:type="dxa"/>
+              <w:bottom w:w="90" w:type="dxa"/>
+              <w:end w:w="100" w:type="dxa"/>
+            </w:tcMar>
+          </w:tcPr>
+          <w:p>
+            <w:r>
+              <w:rPr>
+                <w:b/>
+                <w:color w:val="FFFFFF"/>
+                <w:sz w:val="16"/>
+              </w:rPr>
+              <w:t>Answer anchor</w:t>
+            </w:r>
+          </w:p>
+        </w:tc>
+      </w:tr>
+      <w:tr>
+        <w:trPr>
+          <w:cantSplit/>
+        </w:trPr>
+        <w:tc>
+          <w:tcPr>
+            <w:tcW w:type="dxa" w:w="3384"/>
+            <w:tcMar>
+              <w:top w:w="90" w:type="dxa"/>
+              <w:start w:w="100" w:type="dxa"/>
+              <w:bottom w:w="90" w:type="dxa"/>
+              <w:end w:w="100" w:type="dxa"/>
+            </w:tcMar>
+            <w:shd w:fill="E8EEF5"/>
+          </w:tcPr>
+          <w:p>
+            <w:r>
+              <w:rPr>
+                <w:b/>
+                <w:sz w:val="16"/>
+              </w:rPr>
+              <w:t>What is the biggest difference between Prefect OSS and Prefect Cloud?</w:t>
+            </w:r>
+          </w:p>
+        </w:tc>
+        <w:tc>
+          <w:tcPr>
+            <w:tcW w:type="dxa" w:w="5472"/>
+            <w:tcMar>
+              <w:top w:w="90" w:type="dxa"/>
+              <w:start w:w="100" w:type="dxa"/>
+              <w:bottom w:w="90" w:type="dxa"/>
+              <w:end w:w="100" w:type="dxa"/>
+            </w:tcMar>
+          </w:tcPr>
+          <w:p>
+            <w:r>
+              <w:rPr>
+                <w:sz w:val="16"/>
+              </w:rPr>
+              <w:t>Ownership of the orchestration control plane. Self-hosted means we operate API/server, DB, upgrades and availability; Cloud moves that responsibility to Prefect while execution can remain in our AWS account.</w:t>
+            </w:r>
+          </w:p>
+        </w:tc>
+      </w:tr>
+      <w:tr>
+        <w:trPr>
+          <w:cantSplit/>
+        </w:trPr>
+        <w:tc>
+          <w:tcPr>
+            <w:tcW w:type="dxa" w:w="3384"/>
+            <w:tcMar>
+              <w:top w:w="90" w:type="dxa"/>
+              <w:start w:w="100" w:type="dxa"/>
+              <w:bottom w:w="90" w:type="dxa"/>
+              <w:end w:w="100" w:type="dxa"/>
+            </w:tcMar>
+            <w:shd w:fill="E8EEF5"/>
+          </w:tcPr>
+          <w:p>
+            <w:r>
+              <w:rPr>
+                <w:b/>
+                <w:sz w:val="16"/>
+              </w:rPr>
+              <w:t>Does moving to Prefect Cloud mean our trading data runs in Prefect infrastructure?</w:t>
+            </w:r>
+          </w:p>
+        </w:tc>
+        <w:tc>
+          <w:tcPr>
+            <w:tcW w:type="dxa" w:w="5472"/>
+            <w:tcMar>
+              <w:top w:w="90" w:type="dxa"/>
+              <w:start w:w="100" w:type="dxa"/>
+              <w:bottom w:w="90" w:type="dxa"/>
+              <w:end w:w="100" w:type="dxa"/>
+            </w:tcMar>
+          </w:tcPr>
+          <w:p>
+            <w:r>
+              <w:rPr>
+                <w:sz w:val="16"/>
+              </w:rPr>
+              <w:t>Not necessarily. With hybrid work pools, workers and ECS flow tasks can remain inside Vitol AWS; the Cloud service coordinates orchestration.</w:t>
+            </w:r>
+          </w:p>
+        </w:tc>
+      </w:tr>
+      <w:tr>
+        <w:trPr>
+          <w:cantSplit/>
+        </w:trPr>
+        <w:tc>
+          <w:tcPr>
+            <w:tcW w:type="dxa" w:w="3384"/>
+            <w:tcMar>
+              <w:top w:w="90" w:type="dxa"/>
+              <w:start w:w="100" w:type="dxa"/>
+              <w:bottom w:w="90" w:type="dxa"/>
+              <w:end w:w="100" w:type="dxa"/>
+            </w:tcMar>
+            <w:shd w:fill="E8EEF5"/>
+          </w:tcPr>
+          <w:p>
+            <w:r>
+              <w:rPr>
+                <w:b/>
+                <w:sz w:val="16"/>
+              </w:rPr>
+              <w:t>What remains our responsibility after moving to Cloud?</w:t>
+            </w:r>
+          </w:p>
+        </w:tc>
+        <w:tc>
+          <w:tcPr>
+            <w:tcW w:type="dxa" w:w="5472"/>
+            <w:tcMar>
+              <w:top w:w="90" w:type="dxa"/>
+              <w:start w:w="100" w:type="dxa"/>
+              <w:bottom w:w="90" w:type="dxa"/>
+              <w:end w:w="100" w:type="dxa"/>
+            </w:tcMar>
+          </w:tcPr>
+          <w:p>
+            <w:r>
+              <w:rPr>
+                <w:sz w:val="16"/>
+              </w:rPr>
+              <w:t>Workers/execution, Docker images, ECS, IAM, ECR, Secrets Manager, networking, workflow code, business monitoring, incident/recovery procedures and compatibility testing.</w:t>
+            </w:r>
+          </w:p>
+        </w:tc>
+      </w:tr>
+      <w:tr>
+        <w:trPr>
+          <w:cantSplit/>
+        </w:trPr>
+        <w:tc>
+          <w:tcPr>
+            <w:tcW w:type="dxa" w:w="3384"/>
+            <w:tcMar>
+              <w:top w:w="90" w:type="dxa"/>
+              <w:start w:w="100" w:type="dxa"/>
+              <w:bottom w:w="90" w:type="dxa"/>
+              <w:end w:w="100" w:type="dxa"/>
+            </w:tcMar>
+            <w:shd w:fill="E8EEF5"/>
+          </w:tcPr>
+          <w:p>
+            <w:r>
+              <w:rPr>
+                <w:b/>
+                <w:sz w:val="16"/>
+              </w:rPr>
+              <w:t>Why would we stay self-hosted?</w:t>
+            </w:r>
+          </w:p>
+        </w:tc>
+        <w:tc>
+          <w:tcPr>
+            <w:tcW w:type="dxa" w:w="5472"/>
+            <w:tcMar>
+              <w:top w:w="90" w:type="dxa"/>
+              <w:start w:w="100" w:type="dxa"/>
+              <w:bottom w:w="90" w:type="dxa"/>
+              <w:end w:w="100" w:type="dxa"/>
+            </w:tcMar>
+          </w:tcPr>
+          <w:p>
+            <w:r>
+              <w:rPr>
+                <w:sz w:val="16"/>
+              </w:rPr>
+              <w:t>Maximum control, internal-only connectivity, existing economics/compliance requirements or vendor-risk constraints may justify it if operational burden is acceptable.</w:t>
+            </w:r>
+          </w:p>
+        </w:tc>
+      </w:tr>
+      <w:tr>
+        <w:trPr>
+          <w:cantSplit/>
+        </w:trPr>
+        <w:tc>
+          <w:tcPr>
+            <w:tcW w:type="dxa" w:w="3384"/>
+            <w:tcMar>
+              <w:top w:w="90" w:type="dxa"/>
+              <w:start w:w="100" w:type="dxa"/>
+              <w:bottom w:w="90" w:type="dxa"/>
+              <w:end w:w="100" w:type="dxa"/>
+            </w:tcMar>
+            <w:shd w:fill="E8EEF5"/>
+          </w:tcPr>
+          <w:p>
+            <w:r>
+              <w:rPr>
+                <w:b/>
+                <w:sz w:val="16"/>
+              </w:rPr>
+              <w:t>How would you decide?</w:t>
+            </w:r>
+          </w:p>
+        </w:tc>
+        <w:tc>
+          <w:tcPr>
+            <w:tcW w:type="dxa" w:w="5472"/>
+            <w:tcMar>
+              <w:top w:w="90" w:type="dxa"/>
+              <w:start w:w="100" w:type="dxa"/>
+              <w:bottom w:w="90" w:type="dxa"/>
+              <w:end w:w="100" w:type="dxa"/>
+            </w:tcMar>
+          </w:tcPr>
+          <w:p>
+            <w:r>
+              <w:rPr>
+                <w:sz w:val="16"/>
+              </w:rPr>
+              <w:t>Weighted scorecard across functional fit, security/data, identity/RBAC, operations, reliability, migration, cost, developer experience, compliance and exit strategy, backed by a representative failure-mode POC.</w:t>
+            </w:r>
+          </w:p>
+        </w:tc>
+      </w:tr>
+    </w:tbl>
+    <w:p>
+      <w:pPr>
+        <w:pStyle w:val="Heading2"/>
+      </w:pPr>
+      <w:r>
+        <w:t>Memorise this interview answer</w:t>
+      </w:r>
+    </w:p>
+    <w:tbl>
+      <w:tblPr>
+        <w:tblW w:type="auto" w:w="0"/>
+        <w:jc w:val="center"/>
+        <w:tblLook w:firstColumn="1" w:firstRow="1" w:lastColumn="0" w:lastRow="0" w:noHBand="0" w:noVBand="1" w:val="04A0"/>
+      </w:tblPr>
+      <w:tblGrid>
+        <w:gridCol w:w="10454"/>
+      </w:tblGrid>
+      <w:tr>
+        <w:trPr>
+          <w:cantSplit/>
+        </w:trPr>
+        <w:tc>
+          <w:tcPr>
+            <w:tcW w:type="dxa" w:w="10454"/>
+            <w:shd w:fill="EAF4EA"/>
+            <w:tcMar>
+              <w:top w:w="120" w:type="dxa"/>
+              <w:start w:w="150" w:type="dxa"/>
+              <w:bottom w:w="120" w:type="dxa"/>
+              <w:end w:w="150" w:type="dxa"/>
+            </w:tcMar>
+          </w:tcPr>
+          <w:p>
+            <w:pPr/>
+            <w:r>
+              <w:rPr>
+                <w:b/>
+                <w:color w:val="123B63"/>
+              </w:rPr>
+              <w:t xml:space="preserve">ANSWER  </w:t>
+            </w:r>
+            <w:r>
+              <w:t>The fundamental difference is ownership of the orchestration control plane. With self-hosted Prefect, we operate the API, database, upgrades, availability and associated infrastructure ourselves. With Prefect Cloud, Prefect manages that control plane and provides additional enterprise capabilities such as SSO, RBAC, service accounts and auditability depending on the subscription. Importantly, that does not mean our workloads need to leave AWS - we can retain ECS workers and flow execution inside our own account using a hybrid model. So for Vitol the decision is whether the reduction in operational burden and improved enterprise controls justify the SaaS cost, security considerations and migration risk.</w:t>
+            </w:r>
+          </w:p>
+        </w:tc>
+      </w:tr>
+    </w:tbl>
+    <w:p>
+      <w:pPr>
+        <w:pStyle w:val="Heading2"/>
+      </w:pPr>
+      <w:r>
+        <w:t>One-line memory aid</w:t>
+      </w:r>
+    </w:p>
+    <w:tbl>
+      <w:tblPr>
+        <w:tblW w:type="auto" w:w="0"/>
+        <w:jc w:val="center"/>
+        <w:tblLook w:firstColumn="1" w:firstRow="1" w:lastColumn="0" w:lastRow="0" w:noHBand="0" w:noVBand="1" w:val="04A0"/>
+      </w:tblPr>
+      <w:tblGrid>
+        <w:gridCol w:w="10454"/>
+      </w:tblGrid>
+      <w:tr>
+        <w:trPr>
+          <w:cantSplit/>
+        </w:trPr>
+        <w:tc>
+          <w:tcPr>
+            <w:tcW w:type="dxa" w:w="10454"/>
+            <w:shd w:fill="F3F5F7"/>
+            <w:tcMar>
+              <w:top w:w="100" w:type="dxa"/>
+              <w:start w:w="140" w:type="dxa"/>
+              <w:bottom w:w="100" w:type="dxa"/>
+              <w:end w:w="140" w:type="dxa"/>
+            </w:tcMar>
+          </w:tcPr>
+          <w:p>
+            <w:pPr>
+              <w:pStyle w:val="Code"/>
+              <w:spacing w:after="0"/>
+            </w:pPr>
+            <w:r>
+              <w:t>OSS SELF-HOSTED = Vitol owns CONTROL PLANE + EXECUTION</w:t>
+            </w:r>
+            <w:r>
+              <w:br/>
+            </w:r>
+            <w:r>
+              <w:t>PREFECT CLOUD   = Prefect owns CONTROL PLANE; Vitol can still own EXECUTION</w:t>
+            </w:r>
+          </w:p>
+        </w:tc>
+      </w:tr>
+    </w:tbl>
+    <w:p>
+      <w:pPr>
+        <w:pageBreakBefore/>
         <w:spacing w:after="0"/>
       </w:pPr>
       <w:r>

</xml_diff>